<commit_message>
Add ESUSD partnership correspondence and PDF generators
Implementation plan, partnership email, and DOCX/PDF generation scripts
for the El Segundo Unified School District pilot. Sessions are monthly
after-school. Tables are page-break protected.

Co-Authored-By: Claude Opus 4.7 (1M context) <noreply@anthropic.com>
</commit_message>
<xml_diff>
--- a/internal/ingestion/correspondence/esusd-partnership/ESUSD_Implementation_Plan.docx
+++ b/internal/ingestion/correspondence/esusd-partnership/ESUSD_Implementation_Plan.docx
@@ -187,6 +187,10 @@
         <w:gridCol w:w="4680"/>
       </w:tblGrid>
       <w:tr>
+        <w:trPr>
+          <w:cantSplit w:val="true"/>
+          <w:keepNext w:val="true"/>
+        </w:trPr>
         <w:tc>
           <w:tcPr>
             <w:shd w:val="clear" w:color="auto" w:fill="2D2D2D"/>
@@ -261,6 +265,10 @@
         </w:tc>
       </w:tr>
       <w:tr>
+        <w:trPr>
+          <w:cantSplit w:val="true"/>
+          <w:keepNext w:val="true"/>
+        </w:trPr>
         <w:tc>
           <w:tcPr>
             <w:shd w:val="clear" w:color="auto" w:fill="FFFFFF"/>
@@ -335,6 +343,10 @@
         </w:tc>
       </w:tr>
       <w:tr>
+        <w:trPr>
+          <w:cantSplit w:val="true"/>
+          <w:keepNext w:val="true"/>
+        </w:trPr>
         <w:tc>
           <w:tcPr>
             <w:shd w:val="clear" w:color="auto" w:fill="F5F5F5"/>
@@ -409,6 +421,10 @@
         </w:tc>
       </w:tr>
       <w:tr>
+        <w:trPr>
+          <w:cantSplit w:val="true"/>
+          <w:keepNext w:val="true"/>
+        </w:trPr>
         <w:tc>
           <w:tcPr>
             <w:shd w:val="clear" w:color="auto" w:fill="FFFFFF"/>
@@ -477,12 +493,16 @@
                 <w:color w:val="333333"/>
                 <w:sz w:val="18"/>
               </w:rPr>
-              <w:t>Weekly 90-minute sessions</w:t>
+              <w:t>Monthly 90-minute after-school sessions</w:t>
             </w:r>
           </w:p>
         </w:tc>
       </w:tr>
       <w:tr>
+        <w:trPr>
+          <w:cantSplit w:val="true"/>
+          <w:keepNext w:val="true"/>
+        </w:trPr>
         <w:tc>
           <w:tcPr>
             <w:shd w:val="clear" w:color="auto" w:fill="F5F5F5"/>
@@ -557,6 +577,10 @@
         </w:tc>
       </w:tr>
       <w:tr>
+        <w:trPr>
+          <w:cantSplit w:val="true"/>
+          <w:keepNext w:val="true"/>
+        </w:trPr>
         <w:tc>
           <w:tcPr>
             <w:shd w:val="clear" w:color="auto" w:fill="FFFFFF"/>
@@ -631,6 +655,10 @@
         </w:tc>
       </w:tr>
       <w:tr>
+        <w:trPr>
+          <w:cantSplit w:val="true"/>
+          <w:keepNext w:val="true"/>
+        </w:trPr>
         <w:tc>
           <w:tcPr>
             <w:shd w:val="clear" w:color="auto" w:fill="F5F5F5"/>
@@ -705,6 +733,9 @@
         </w:tc>
       </w:tr>
       <w:tr>
+        <w:trPr>
+          <w:cantSplit w:val="true"/>
+        </w:trPr>
         <w:tc>
           <w:tcPr>
             <w:shd w:val="clear" w:color="auto" w:fill="FFFFFF"/>
@@ -852,7 +883,7 @@
           <w:rFonts w:ascii="Inter" w:hAnsi="Inter"/>
           <w:sz w:val="22"/>
         </w:rPr>
-        <w:t xml:space="preserve"> — Complete SkaFld Ideation Methodology curriculum for weekly 90-minute sessions. Teacher mentor training and ongoing support.</w:t>
+        <w:t xml:space="preserve"> — Complete SkaFld Ideation Methodology curriculum for monthly 90-minute after-school sessions. Teacher mentor training and ongoing support.</w:t>
       </w:r>
     </w:p>
     <w:p>
@@ -993,7 +1024,7 @@
           <w:rFonts w:ascii="Inter" w:hAnsi="Inter"/>
           <w:sz w:val="22"/>
         </w:rPr>
-        <w:t xml:space="preserve"> — A classroom or meeting space for weekly 90-minute sessions (after school or embedded in CTE block, TBD).</w:t>
+        <w:t xml:space="preserve"> — A classroom or meeting space for monthly 90-minute after-school sessions.</w:t>
       </w:r>
     </w:p>
     <w:p>
@@ -1043,7 +1074,7 @@
           <w:rFonts w:ascii="Inter" w:hAnsi="Inter"/>
           <w:sz w:val="22"/>
         </w:rPr>
-        <w:t xml:space="preserve"> — Help promoting the program to students and families, processing parental consent forms, and supporting equitable recruitment (targeting 50% female, 40% FRL, 30% first-generation).</w:t>
+        <w:t xml:space="preserve"> — Help promoting the program to students and families and processing parental consent forms.</w:t>
       </w:r>
     </w:p>
     <w:p>
@@ -1115,6 +1146,10 @@
         <w:gridCol w:w="3120"/>
       </w:tblGrid>
       <w:tr>
+        <w:trPr>
+          <w:cantSplit w:val="true"/>
+          <w:keepNext w:val="true"/>
+        </w:trPr>
         <w:tc>
           <w:tcPr>
             <w:shd w:val="clear" w:color="auto" w:fill="2D2D2D"/>
@@ -1225,6 +1260,10 @@
         </w:tc>
       </w:tr>
       <w:tr>
+        <w:trPr>
+          <w:cantSplit w:val="true"/>
+          <w:keepNext w:val="true"/>
+        </w:trPr>
         <w:tc>
           <w:tcPr>
             <w:shd w:val="clear" w:color="auto" w:fill="FFFFFF"/>
@@ -1335,6 +1374,10 @@
         </w:tc>
       </w:tr>
       <w:tr>
+        <w:trPr>
+          <w:cantSplit w:val="true"/>
+          <w:keepNext w:val="true"/>
+        </w:trPr>
         <w:tc>
           <w:tcPr>
             <w:shd w:val="clear" w:color="auto" w:fill="F5F5F5"/>
@@ -1445,6 +1488,9 @@
         </w:tc>
       </w:tr>
       <w:tr>
+        <w:trPr>
+          <w:cantSplit w:val="true"/>
+        </w:trPr>
         <w:tc>
           <w:tcPr>
             <w:shd w:val="clear" w:color="auto" w:fill="FFFFFF"/>
@@ -1655,6 +1701,10 @@
         <w:gridCol w:w="3120"/>
       </w:tblGrid>
       <w:tr>
+        <w:trPr>
+          <w:cantSplit w:val="true"/>
+          <w:keepNext w:val="true"/>
+        </w:trPr>
         <w:tc>
           <w:tcPr>
             <w:shd w:val="clear" w:color="auto" w:fill="2D2D2D"/>
@@ -1765,6 +1815,10 @@
         </w:tc>
       </w:tr>
       <w:tr>
+        <w:trPr>
+          <w:cantSplit w:val="true"/>
+          <w:keepNext w:val="true"/>
+        </w:trPr>
         <w:tc>
           <w:tcPr>
             <w:shd w:val="clear" w:color="auto" w:fill="FFFFFF"/>
@@ -1875,6 +1929,10 @@
         </w:tc>
       </w:tr>
       <w:tr>
+        <w:trPr>
+          <w:cantSplit w:val="true"/>
+          <w:keepNext w:val="true"/>
+        </w:trPr>
         <w:tc>
           <w:tcPr>
             <w:shd w:val="clear" w:color="auto" w:fill="F5F5F5"/>
@@ -1943,7 +2001,7 @@
                 <w:color w:val="333333"/>
                 <w:sz w:val="18"/>
               </w:rPr>
-              <w:t>Form team of 12 students; assign employer project brief; launch weekly sessions</w:t>
+              <w:t>Form team of 12 students; assign employer project brief; launch monthly after-school sessions</w:t>
             </w:r>
           </w:p>
         </w:tc>
@@ -1985,6 +2043,9 @@
         </w:tc>
       </w:tr>
       <w:tr>
+        <w:trPr>
+          <w:cantSplit w:val="true"/>
+        </w:trPr>
         <w:tc>
           <w:tcPr>
             <w:shd w:val="clear" w:color="auto" w:fill="FFFFFF"/>
@@ -2172,6 +2233,10 @@
         <w:gridCol w:w="3120"/>
       </w:tblGrid>
       <w:tr>
+        <w:trPr>
+          <w:cantSplit w:val="true"/>
+          <w:keepNext w:val="true"/>
+        </w:trPr>
         <w:tc>
           <w:tcPr>
             <w:shd w:val="clear" w:color="auto" w:fill="2D2D2D"/>
@@ -2282,6 +2347,10 @@
         </w:tc>
       </w:tr>
       <w:tr>
+        <w:trPr>
+          <w:cantSplit w:val="true"/>
+          <w:keepNext w:val="true"/>
+        </w:trPr>
         <w:tc>
           <w:tcPr>
             <w:shd w:val="clear" w:color="auto" w:fill="FFFFFF"/>
@@ -2392,6 +2461,10 @@
         </w:tc>
       </w:tr>
       <w:tr>
+        <w:trPr>
+          <w:cantSplit w:val="true"/>
+          <w:keepNext w:val="true"/>
+        </w:trPr>
         <w:tc>
           <w:tcPr>
             <w:shd w:val="clear" w:color="auto" w:fill="F5F5F5"/>
@@ -2502,6 +2575,9 @@
         </w:tc>
       </w:tr>
       <w:tr>
+        <w:trPr>
+          <w:cantSplit w:val="true"/>
+        </w:trPr>
         <w:tc>
           <w:tcPr>
             <w:shd w:val="clear" w:color="auto" w:fill="FFFFFF"/>
@@ -2668,6 +2744,10 @@
         <w:gridCol w:w="3120"/>
       </w:tblGrid>
       <w:tr>
+        <w:trPr>
+          <w:cantSplit w:val="true"/>
+          <w:keepNext w:val="true"/>
+        </w:trPr>
         <w:tc>
           <w:tcPr>
             <w:shd w:val="clear" w:color="auto" w:fill="2D2D2D"/>
@@ -2778,6 +2858,10 @@
         </w:tc>
       </w:tr>
       <w:tr>
+        <w:trPr>
+          <w:cantSplit w:val="true"/>
+          <w:keepNext w:val="true"/>
+        </w:trPr>
         <w:tc>
           <w:tcPr>
             <w:shd w:val="clear" w:color="auto" w:fill="FFFFFF"/>
@@ -2888,6 +2972,9 @@
         </w:tc>
       </w:tr>
       <w:tr>
+        <w:trPr>
+          <w:cantSplit w:val="true"/>
+        </w:trPr>
         <w:tc>
           <w:tcPr>
             <w:shd w:val="clear" w:color="auto" w:fill="F5F5F5"/>
@@ -3069,6 +3156,10 @@
         <w:gridCol w:w="2340"/>
       </w:tblGrid>
       <w:tr>
+        <w:trPr>
+          <w:cantSplit w:val="true"/>
+          <w:keepNext w:val="true"/>
+        </w:trPr>
         <w:tc>
           <w:tcPr>
             <w:shd w:val="clear" w:color="auto" w:fill="2D2D2D"/>
@@ -3215,6 +3306,10 @@
         </w:tc>
       </w:tr>
       <w:tr>
+        <w:trPr>
+          <w:cantSplit w:val="true"/>
+          <w:keepNext w:val="true"/>
+        </w:trPr>
         <w:tc>
           <w:tcPr>
             <w:shd w:val="clear" w:color="auto" w:fill="FFFFFF"/>
@@ -3361,6 +3456,10 @@
         </w:tc>
       </w:tr>
       <w:tr>
+        <w:trPr>
+          <w:cantSplit w:val="true"/>
+          <w:keepNext w:val="true"/>
+        </w:trPr>
         <w:tc>
           <w:tcPr>
             <w:shd w:val="clear" w:color="auto" w:fill="F5F5F5"/>
@@ -3507,6 +3606,10 @@
         </w:tc>
       </w:tr>
       <w:tr>
+        <w:trPr>
+          <w:cantSplit w:val="true"/>
+          <w:keepNext w:val="true"/>
+        </w:trPr>
         <w:tc>
           <w:tcPr>
             <w:shd w:val="clear" w:color="auto" w:fill="FFFFFF"/>
@@ -3575,7 +3678,7 @@
                 <w:color w:val="333333"/>
                 <w:sz w:val="18"/>
               </w:rPr>
-              <w:t>Identify facility for weekly sessions</w:t>
+              <w:t>Identify facility for monthly after-school sessions</w:t>
             </w:r>
           </w:p>
         </w:tc>
@@ -3653,6 +3756,10 @@
         </w:tc>
       </w:tr>
       <w:tr>
+        <w:trPr>
+          <w:cantSplit w:val="true"/>
+          <w:keepNext w:val="true"/>
+        </w:trPr>
         <w:tc>
           <w:tcPr>
             <w:shd w:val="clear" w:color="auto" w:fill="F5F5F5"/>
@@ -3799,6 +3906,9 @@
         </w:tc>
       </w:tr>
       <w:tr>
+        <w:trPr>
+          <w:cantSplit w:val="true"/>
+        </w:trPr>
         <w:tc>
           <w:tcPr>
             <w:shd w:val="clear" w:color="auto" w:fill="FFFFFF"/>
@@ -3951,7 +4061,7 @@
         <w:keepNext/>
       </w:pPr>
       <w:r>
-        <w:t>Equity Commitments</w:t>
+        <w:t>Team Model</w:t>
       </w:r>
     </w:p>
     <w:p>
@@ -3964,95 +4074,7 @@
           <w:rFonts w:ascii="Inter" w:hAnsi="Inter"/>
           <w:sz w:val="22"/>
         </w:rPr>
-        <w:t>SkaFld Trailhead is designed for equitable access. Recruitment and team formation will target:</w:t>
-      </w:r>
-    </w:p>
-    <w:p>
-      <w:pPr>
-        <w:pStyle w:val="ListParagraph"/>
-        <w:numPr>
-          <w:ilvl w:val="0"/>
-          <w:numId w:val="1"/>
-        </w:numPr>
-        <w:spacing w:before="40" w:after="40" w:line="276" w:lineRule="auto"/>
-      </w:pPr>
-      <w:r>
-        <w:rPr>
-          <w:rFonts w:ascii="Inter" w:hAnsi="Inter"/>
-          <w:b/>
-          <w:sz w:val="22"/>
-        </w:rPr>
-        <w:t>50% female / 50% male</w:t>
-      </w:r>
-      <w:r>
-        <w:rPr>
-          <w:rFonts w:ascii="Inter" w:hAnsi="Inter"/>
-          <w:sz w:val="22"/>
-        </w:rPr>
-        <w:t xml:space="preserve"> participation</w:t>
-      </w:r>
-    </w:p>
-    <w:p>
-      <w:pPr>
-        <w:pStyle w:val="ListParagraph"/>
-        <w:numPr>
-          <w:ilvl w:val="0"/>
-          <w:numId w:val="1"/>
-        </w:numPr>
-        <w:spacing w:before="40" w:after="40" w:line="276" w:lineRule="auto"/>
-      </w:pPr>
-      <w:r>
-        <w:rPr>
-          <w:rFonts w:ascii="Inter" w:hAnsi="Inter"/>
-          <w:b/>
-          <w:sz w:val="22"/>
-        </w:rPr>
-        <w:t>40% Free/Reduced Lunch</w:t>
-      </w:r>
-      <w:r>
-        <w:rPr>
-          <w:rFonts w:ascii="Inter" w:hAnsi="Inter"/>
-          <w:sz w:val="22"/>
-        </w:rPr>
-        <w:t xml:space="preserve"> eligible students</w:t>
-      </w:r>
-    </w:p>
-    <w:p>
-      <w:pPr>
-        <w:pStyle w:val="ListParagraph"/>
-        <w:numPr>
-          <w:ilvl w:val="0"/>
-          <w:numId w:val="1"/>
-        </w:numPr>
-        <w:spacing w:before="40" w:after="40" w:line="276" w:lineRule="auto"/>
-      </w:pPr>
-      <w:r>
-        <w:rPr>
-          <w:rFonts w:ascii="Inter" w:hAnsi="Inter"/>
-          <w:b/>
-          <w:sz w:val="22"/>
-        </w:rPr>
-        <w:t>30% first-generation</w:t>
-      </w:r>
-      <w:r>
-        <w:rPr>
-          <w:rFonts w:ascii="Inter" w:hAnsi="Inter"/>
-          <w:sz w:val="22"/>
-        </w:rPr>
-        <w:t xml:space="preserve"> college-bound students</w:t>
-      </w:r>
-    </w:p>
-    <w:p>
-      <w:pPr>
-        <w:pStyle w:val="p1"/>
-        <w:spacing w:before="60" w:after="60" w:line="276" w:lineRule="auto"/>
-      </w:pPr>
-      <w:r>
-        <w:rPr>
-          <w:rFonts w:ascii="Inter" w:hAnsi="Inter"/>
-          <w:sz w:val="22"/>
-        </w:rPr>
-        <w:t>All platform features are built with accessibility in mind, and the cross-grade team model (12th graders mentoring 10th graders, 11th graders mentoring 9th graders) ensures peer support structures are embedded from day one.</w:t>
+        <w:t>The cross-grade team model (12th graders mentoring 10th graders, 11th graders mentoring 9th graders) ensures peer support structures are embedded from day one. All platform features are built with accessibility in mind.</w:t>
       </w:r>
     </w:p>
     <w:p>
@@ -4100,6 +4122,10 @@
         <w:gridCol w:w="3120"/>
       </w:tblGrid>
       <w:tr>
+        <w:trPr>
+          <w:cantSplit w:val="true"/>
+          <w:keepNext w:val="true"/>
+        </w:trPr>
         <w:tc>
           <w:tcPr>
             <w:shd w:val="clear" w:color="auto" w:fill="2D2D2D"/>
@@ -4210,6 +4236,10 @@
         </w:tc>
       </w:tr>
       <w:tr>
+        <w:trPr>
+          <w:cantSplit w:val="true"/>
+          <w:keepNext w:val="true"/>
+        </w:trPr>
         <w:tc>
           <w:tcPr>
             <w:shd w:val="clear" w:color="auto" w:fill="FFFFFF"/>
@@ -4320,6 +4350,10 @@
         </w:tc>
       </w:tr>
       <w:tr>
+        <w:trPr>
+          <w:cantSplit w:val="true"/>
+          <w:keepNext w:val="true"/>
+        </w:trPr>
         <w:tc>
           <w:tcPr>
             <w:shd w:val="clear" w:color="auto" w:fill="F5F5F5"/>
@@ -4430,6 +4464,10 @@
         </w:tc>
       </w:tr>
       <w:tr>
+        <w:trPr>
+          <w:cantSplit w:val="true"/>
+          <w:keepNext w:val="true"/>
+        </w:trPr>
         <w:tc>
           <w:tcPr>
             <w:shd w:val="clear" w:color="auto" w:fill="FFFFFF"/>
@@ -4540,6 +4578,9 @@
         </w:tc>
       </w:tr>
       <w:tr>
+        <w:trPr>
+          <w:cantSplit w:val="true"/>
+        </w:trPr>
         <w:tc>
           <w:tcPr>
             <w:shd w:val="clear" w:color="auto" w:fill="F5F5F5"/>
@@ -4685,6 +4726,10 @@
         <w:gridCol w:w="3120"/>
       </w:tblGrid>
       <w:tr>
+        <w:trPr>
+          <w:cantSplit w:val="true"/>
+          <w:keepNext w:val="true"/>
+        </w:trPr>
         <w:tc>
           <w:tcPr>
             <w:shd w:val="clear" w:color="auto" w:fill="2D2D2D"/>
@@ -4795,6 +4840,10 @@
         </w:tc>
       </w:tr>
       <w:tr>
+        <w:trPr>
+          <w:cantSplit w:val="true"/>
+          <w:keepNext w:val="true"/>
+        </w:trPr>
         <w:tc>
           <w:tcPr>
             <w:shd w:val="clear" w:color="auto" w:fill="FFFFFF"/>
@@ -4905,6 +4954,9 @@
         </w:tc>
       </w:tr>
       <w:tr>
+        <w:trPr>
+          <w:cantSplit w:val="true"/>
+        </w:trPr>
         <w:tc>
           <w:tcPr>
             <w:shd w:val="clear" w:color="auto" w:fill="F5F5F5"/>

</xml_diff>